<commit_message>
Phase 89: T24-T30, the objective-to-evidence map and the conclusion matrix
T24-T28 regenerated through scripts 31/32/35 (D:/ source paths and
unrecorded places overrides); T28's p-values now use the p_value kind,
so 2.7e-14 prints <0.0001 instead of 0.0000. No data file changed.

T29 quotes the six locked objectives verbatim beside the blueprint's
required evidence and the files that answer them; every named file and
module must exist, and "partial" is computed from the filesystem
(objectives 1, 2, 6 await Phase 92 figures / the Phase 101 literature
table). T30 concludes per objective from generated numbers, each verdict
chosen by a rule printed in the row.

Gate T89.7 PASS. Full suite: 2060 passed, 37 skipped.

Co-Authored-By: Claude Opus 5 <noreply@anthropic.com>
</commit_message>
<xml_diff>
--- a/outputs/10_robustness/T27_false_positive_and_false_negative_analysis.docx
+++ b/outputs/10_robustness/T27_false_positive_and_false_negative_analysis.docx
@@ -10122,7 +10122,7 @@
           <w:i/>
           <w:sz w:val="14"/>
         </w:rPr>
-        <w:t>Source: D:/Projects/HeartGuard/outputs/10_robustness/failure_analysis/failures_by_category.csv; D:/Projects/HeartGuard/outputs/10_robustness/failure_analysis/false_positives_and_negatives.csv; D:/Projects/HeartGuard/outputs/10_robustness/failure_analysis/record_failures.csv; D:/Projects/HeartGuard/outputs/10_robustness/failure_analysis/confused_class_pairs.csv</w:t>
+        <w:t>Source: outputs/10_robustness/failure_analysis/failures_by_category.csv; outputs/10_robustness/failure_analysis/false_positives_and_negatives.csv; outputs/10_robustness/failure_analysis/record_failures.csv; outputs/10_robustness/failure_analysis/confused_class_pairs.csv</w:t>
       </w:r>
     </w:p>
     <w:p>
@@ -10131,7 +10131,7 @@
           <w:i/>
           <w:sz w:val="14"/>
         </w:rPr>
-        <w:t>Generated by PV-MEPCG / PulseVision at 2026-09-10T11:47:17.467448+00:00</w:t>
+        <w:t>Generated by PV-MEPCG / PulseVision at 2026-09-10T17:10:27.716189+00:00</w:t>
       </w:r>
     </w:p>
     <w:sectPr>

</xml_diff>